<commit_message>
Update Mizbah Uddin as Program Officer and Adv. Aminul Islam Bulbul as Legal Officer in SKB team onboarding
</commit_message>
<xml_diff>
--- a/Clarification_Letter_Underage_Beneficiaries_Project_22567_Updated.docx
+++ b/Clarification_Letter_Underage_Beneficiaries_Project_22567_Updated.docx
@@ -48,16 +48,7 @@
           <w:sz w:val="24"/>
           <w:szCs w:val="24"/>
         </w:rPr>
-        <w:t>and</w:t>
-      </w:r>
-      <w:r>
-        <w:rPr>
-          <w:rFonts w:ascii="Times New Roman" w:hAnsi="Times New Roman" w:cs="Times New Roman"/>
-          <w:b/>
-          <w:sz w:val="24"/>
-          <w:szCs w:val="24"/>
-        </w:rPr>
-        <w:t xml:space="preserve"> </w:t>
+        <w:t xml:space="preserve">and </w:t>
       </w:r>
       <w:r>
         <w:rPr>
@@ -457,17 +448,17 @@
         <w:tblLook w:val="04A0" w:firstRow="1" w:lastRow="0" w:firstColumn="1" w:lastColumn="0" w:noHBand="0" w:noVBand="1"/>
       </w:tblPr>
       <w:tblGrid>
-        <w:gridCol w:w="864"/>
-        <w:gridCol w:w="2160"/>
-        <w:gridCol w:w="2329"/>
-        <w:gridCol w:w="2693"/>
-        <w:gridCol w:w="1134"/>
-        <w:gridCol w:w="2052"/>
+        <w:gridCol w:w="675"/>
+        <w:gridCol w:w="2127"/>
+        <w:gridCol w:w="1984"/>
+        <w:gridCol w:w="2977"/>
+        <w:gridCol w:w="1701"/>
+        <w:gridCol w:w="1768"/>
       </w:tblGrid>
       <w:tr>
         <w:tc>
           <w:tcPr>
-            <w:tcW w:w="864" w:type="dxa"/>
+            <w:tcW w:w="675" w:type="dxa"/>
           </w:tcPr>
           <w:p>
             <w:pPr>
@@ -481,16 +472,16 @@
               <w:rPr>
                 <w:rFonts w:ascii="Times New Roman" w:hAnsi="Times New Roman" w:cs="Times New Roman"/>
                 <w:b/>
-                <w:szCs w:val="28"/>
-              </w:rPr>
-              <w:lastRenderedPageBreak/>
+                <w:sz w:val="32"/>
+                <w:szCs w:val="40"/>
+              </w:rPr>
               <w:t>SL</w:t>
             </w:r>
           </w:p>
         </w:tc>
         <w:tc>
           <w:tcPr>
-            <w:tcW w:w="2160" w:type="dxa"/>
+            <w:tcW w:w="2127" w:type="dxa"/>
           </w:tcPr>
           <w:p>
             <w:pPr>
@@ -514,7 +505,7 @@
         </w:tc>
         <w:tc>
           <w:tcPr>
-            <w:tcW w:w="2329" w:type="dxa"/>
+            <w:tcW w:w="1984" w:type="dxa"/>
           </w:tcPr>
           <w:p>
             <w:pPr>
@@ -532,13 +523,13 @@
                 <w:sz w:val="28"/>
                 <w:szCs w:val="36"/>
               </w:rPr>
-              <w:t>Child DOB / Age</w:t>
+              <w:t>Child DOB</w:t>
             </w:r>
           </w:p>
         </w:tc>
         <w:tc>
           <w:tcPr>
-            <w:tcW w:w="2693" w:type="dxa"/>
+            <w:tcW w:w="2977" w:type="dxa"/>
           </w:tcPr>
           <w:p>
             <w:pPr>
@@ -562,7 +553,7 @@
         </w:tc>
         <w:tc>
           <w:tcPr>
-            <w:tcW w:w="1134" w:type="dxa"/>
+            <w:tcW w:w="1701" w:type="dxa"/>
           </w:tcPr>
           <w:p>
             <w:pPr>
@@ -570,15 +561,15 @@
               <w:rPr>
                 <w:rFonts w:ascii="Times New Roman" w:hAnsi="Times New Roman" w:cs="Times New Roman"/>
                 <w:sz w:val="28"/>
-                <w:szCs w:val="36"/>
+                <w:szCs w:val="28"/>
               </w:rPr>
             </w:pPr>
             <w:r>
               <w:rPr>
                 <w:rFonts w:ascii="Times New Roman" w:hAnsi="Times New Roman" w:cs="Times New Roman"/>
                 <w:b/>
-                <w:sz w:val="28"/>
-                <w:szCs w:val="36"/>
+                <w:sz w:val="24"/>
+                <w:szCs w:val="24"/>
               </w:rPr>
               <w:t>Relationship</w:t>
             </w:r>
@@ -586,7 +577,7 @@
         </w:tc>
         <w:tc>
           <w:tcPr>
-            <w:tcW w:w="2052" w:type="dxa"/>
+            <w:tcW w:w="1768" w:type="dxa"/>
           </w:tcPr>
           <w:p>
             <w:pPr>
@@ -612,7 +603,7 @@
       <w:tr>
         <w:tc>
           <w:tcPr>
-            <w:tcW w:w="864" w:type="dxa"/>
+            <w:tcW w:w="675" w:type="dxa"/>
           </w:tcPr>
           <w:p>
             <w:pPr>
@@ -629,13 +620,14 @@
                 <w:sz w:val="32"/>
                 <w:szCs w:val="40"/>
               </w:rPr>
+              <w:lastRenderedPageBreak/>
               <w:t>01</w:t>
             </w:r>
           </w:p>
         </w:tc>
         <w:tc>
           <w:tcPr>
-            <w:tcW w:w="2160" w:type="dxa"/>
+            <w:tcW w:w="2127" w:type="dxa"/>
           </w:tcPr>
           <w:p>
             <w:pPr>
@@ -658,7 +650,7 @@
         </w:tc>
         <w:tc>
           <w:tcPr>
-            <w:tcW w:w="2329" w:type="dxa"/>
+            <w:tcW w:w="1984" w:type="dxa"/>
           </w:tcPr>
           <w:p>
             <w:pPr>
@@ -680,12 +672,13 @@
         </w:tc>
         <w:tc>
           <w:tcPr>
-            <w:tcW w:w="2693" w:type="dxa"/>
+            <w:tcW w:w="2977" w:type="dxa"/>
           </w:tcPr>
           <w:p>
             <w:pPr>
               <w:rPr>
                 <w:rFonts w:ascii="Times New Roman" w:hAnsi="Times New Roman" w:cs="Times New Roman"/>
+                <w:b/>
                 <w:sz w:val="32"/>
                 <w:szCs w:val="40"/>
               </w:rPr>
@@ -703,7 +696,7 @@
         </w:tc>
         <w:tc>
           <w:tcPr>
-            <w:tcW w:w="1134" w:type="dxa"/>
+            <w:tcW w:w="1701" w:type="dxa"/>
           </w:tcPr>
           <w:p>
             <w:pPr>
@@ -726,8 +719,18 @@
         </w:tc>
         <w:tc>
           <w:tcPr>
-            <w:tcW w:w="2052" w:type="dxa"/>
+            <w:tcW w:w="1768" w:type="dxa"/>
           </w:tcPr>
+          <w:p>
+            <w:pPr>
+              <w:jc w:val="center"/>
+              <w:rPr>
+                <w:rFonts w:ascii="Times New Roman" w:hAnsi="Times New Roman" w:cs="Times New Roman"/>
+                <w:sz w:val="32"/>
+                <w:szCs w:val="40"/>
+              </w:rPr>
+            </w:pPr>
+          </w:p>
           <w:p>
             <w:pPr>
               <w:jc w:val="center"/>
@@ -743,7 +746,7 @@
       <w:tr>
         <w:tc>
           <w:tcPr>
-            <w:tcW w:w="864" w:type="dxa"/>
+            <w:tcW w:w="675" w:type="dxa"/>
           </w:tcPr>
           <w:p>
             <w:pPr>
@@ -766,7 +769,7 @@
         </w:tc>
         <w:tc>
           <w:tcPr>
-            <w:tcW w:w="2160" w:type="dxa"/>
+            <w:tcW w:w="2127" w:type="dxa"/>
           </w:tcPr>
           <w:p>
             <w:pPr>
@@ -804,7 +807,7 @@
         </w:tc>
         <w:tc>
           <w:tcPr>
-            <w:tcW w:w="2329" w:type="dxa"/>
+            <w:tcW w:w="1984" w:type="dxa"/>
           </w:tcPr>
           <w:p>
             <w:pPr>
@@ -826,14 +829,13 @@
         </w:tc>
         <w:tc>
           <w:tcPr>
-            <w:tcW w:w="2693" w:type="dxa"/>
+            <w:tcW w:w="2977" w:type="dxa"/>
           </w:tcPr>
           <w:p>
             <w:pPr>
               <w:rPr>
                 <w:rFonts w:ascii="Times New Roman" w:hAnsi="Times New Roman" w:cs="Times New Roman"/>
                 <w:b/>
-                <w:bCs/>
                 <w:sz w:val="32"/>
                 <w:szCs w:val="40"/>
               </w:rPr>
@@ -842,7 +844,6 @@
               <w:rPr>
                 <w:rFonts w:ascii="Times New Roman" w:hAnsi="Times New Roman" w:cs="Times New Roman"/>
                 <w:b/>
-                <w:bCs/>
                 <w:sz w:val="32"/>
                 <w:szCs w:val="40"/>
               </w:rPr>
@@ -852,7 +853,7 @@
         </w:tc>
         <w:tc>
           <w:tcPr>
-            <w:tcW w:w="1134" w:type="dxa"/>
+            <w:tcW w:w="1701" w:type="dxa"/>
           </w:tcPr>
           <w:p>
             <w:pPr>
@@ -875,7 +876,7 @@
         </w:tc>
         <w:tc>
           <w:tcPr>
-            <w:tcW w:w="2052" w:type="dxa"/>
+            <w:tcW w:w="1768" w:type="dxa"/>
           </w:tcPr>
           <w:p>
             <w:pPr>
@@ -902,7 +903,7 @@
       <w:tr>
         <w:tc>
           <w:tcPr>
-            <w:tcW w:w="864" w:type="dxa"/>
+            <w:tcW w:w="675" w:type="dxa"/>
           </w:tcPr>
           <w:p>
             <w:pPr>
@@ -925,7 +926,7 @@
         </w:tc>
         <w:tc>
           <w:tcPr>
-            <w:tcW w:w="2160" w:type="dxa"/>
+            <w:tcW w:w="2127" w:type="dxa"/>
           </w:tcPr>
           <w:p>
             <w:pPr>
@@ -948,7 +949,7 @@
         </w:tc>
         <w:tc>
           <w:tcPr>
-            <w:tcW w:w="2329" w:type="dxa"/>
+            <w:tcW w:w="1984" w:type="dxa"/>
           </w:tcPr>
           <w:p>
             <w:pPr>
@@ -970,12 +971,13 @@
         </w:tc>
         <w:tc>
           <w:tcPr>
-            <w:tcW w:w="2693" w:type="dxa"/>
+            <w:tcW w:w="2977" w:type="dxa"/>
           </w:tcPr>
           <w:p>
             <w:pPr>
               <w:rPr>
                 <w:rFonts w:ascii="Times New Roman" w:hAnsi="Times New Roman" w:cs="Times New Roman"/>
+                <w:b/>
                 <w:sz w:val="32"/>
                 <w:szCs w:val="40"/>
               </w:rPr>
@@ -993,7 +995,7 @@
         </w:tc>
         <w:tc>
           <w:tcPr>
-            <w:tcW w:w="1134" w:type="dxa"/>
+            <w:tcW w:w="1701" w:type="dxa"/>
           </w:tcPr>
           <w:p>
             <w:pPr>
@@ -1016,7 +1018,7 @@
         </w:tc>
         <w:tc>
           <w:tcPr>
-            <w:tcW w:w="2052" w:type="dxa"/>
+            <w:tcW w:w="1768" w:type="dxa"/>
           </w:tcPr>
           <w:p>
             <w:pPr>
@@ -1043,7 +1045,7 @@
       <w:tr>
         <w:tc>
           <w:tcPr>
-            <w:tcW w:w="864" w:type="dxa"/>
+            <w:tcW w:w="675" w:type="dxa"/>
           </w:tcPr>
           <w:p>
             <w:pPr>
@@ -1066,7 +1068,7 @@
         </w:tc>
         <w:tc>
           <w:tcPr>
-            <w:tcW w:w="2160" w:type="dxa"/>
+            <w:tcW w:w="2127" w:type="dxa"/>
           </w:tcPr>
           <w:p>
             <w:pPr>
@@ -1100,7 +1102,7 @@
         </w:tc>
         <w:tc>
           <w:tcPr>
-            <w:tcW w:w="2329" w:type="dxa"/>
+            <w:tcW w:w="1984" w:type="dxa"/>
           </w:tcPr>
           <w:p>
             <w:pPr>
@@ -1122,12 +1124,13 @@
         </w:tc>
         <w:tc>
           <w:tcPr>
-            <w:tcW w:w="2693" w:type="dxa"/>
+            <w:tcW w:w="2977" w:type="dxa"/>
           </w:tcPr>
           <w:p>
             <w:pPr>
               <w:rPr>
                 <w:rFonts w:ascii="Times New Roman" w:hAnsi="Times New Roman" w:cs="Times New Roman"/>
+                <w:b/>
                 <w:sz w:val="32"/>
                 <w:szCs w:val="40"/>
               </w:rPr>
@@ -1139,13 +1142,22 @@
                 <w:sz w:val="32"/>
                 <w:szCs w:val="40"/>
               </w:rPr>
-              <w:t>Mohammad Ahad</w:t>
+              <w:t xml:space="preserve"> </w:t>
+            </w:r>
+            <w:r>
+              <w:rPr>
+                <w:rFonts w:ascii="Times New Roman" w:hAnsi="Times New Roman" w:cs="Times New Roman"/>
+                <w:b/>
+                <w:sz w:val="32"/>
+                <w:szCs w:val="40"/>
+              </w:rPr>
+              <w:t>Rabeya Begum</w:t>
             </w:r>
           </w:p>
         </w:tc>
         <w:tc>
           <w:tcPr>
-            <w:tcW w:w="1134" w:type="dxa"/>
+            <w:tcW w:w="1701" w:type="dxa"/>
           </w:tcPr>
           <w:p>
             <w:pPr>
@@ -1162,13 +1174,29 @@
                 <w:sz w:val="28"/>
                 <w:szCs w:val="36"/>
               </w:rPr>
-              <w:t>Father</w:t>
+              <w:t>Mother</w:t>
+            </w:r>
+            <w:r>
+              <w:rPr>
+                <w:rFonts w:ascii="Times New Roman" w:hAnsi="Times New Roman" w:cs="Times New Roman"/>
+                <w:sz w:val="28"/>
+                <w:szCs w:val="36"/>
+              </w:rPr>
+              <w:t xml:space="preserve"> </w:t>
+            </w:r>
+            <w:r>
+              <w:rPr>
+                <w:rFonts w:ascii="Times New Roman" w:hAnsi="Times New Roman" w:cs="Times New Roman"/>
+                <w:sz w:val="28"/>
+                <w:szCs w:val="36"/>
+              </w:rPr>
+              <w:t xml:space="preserve"> </w:t>
             </w:r>
           </w:p>
         </w:tc>
         <w:tc>
           <w:tcPr>
-            <w:tcW w:w="2052" w:type="dxa"/>
+            <w:tcW w:w="1768" w:type="dxa"/>
           </w:tcPr>
           <w:p>
             <w:pPr>
@@ -1185,7 +1213,7 @@
       <w:tr>
         <w:tc>
           <w:tcPr>
-            <w:tcW w:w="864" w:type="dxa"/>
+            <w:tcW w:w="675" w:type="dxa"/>
           </w:tcPr>
           <w:p>
             <w:pPr>
@@ -1208,7 +1236,7 @@
         </w:tc>
         <w:tc>
           <w:tcPr>
-            <w:tcW w:w="2160" w:type="dxa"/>
+            <w:tcW w:w="2127" w:type="dxa"/>
           </w:tcPr>
           <w:p>
             <w:pPr>
@@ -1231,7 +1259,7 @@
         </w:tc>
         <w:tc>
           <w:tcPr>
-            <w:tcW w:w="2329" w:type="dxa"/>
+            <w:tcW w:w="1984" w:type="dxa"/>
           </w:tcPr>
           <w:p>
             <w:pPr>
@@ -1253,12 +1281,13 @@
         </w:tc>
         <w:tc>
           <w:tcPr>
-            <w:tcW w:w="2693" w:type="dxa"/>
+            <w:tcW w:w="2977" w:type="dxa"/>
           </w:tcPr>
           <w:p>
             <w:pPr>
               <w:rPr>
                 <w:rFonts w:ascii="Times New Roman" w:hAnsi="Times New Roman" w:cs="Times New Roman"/>
+                <w:b/>
                 <w:sz w:val="32"/>
                 <w:szCs w:val="40"/>
               </w:rPr>
@@ -1276,7 +1305,7 @@
         </w:tc>
         <w:tc>
           <w:tcPr>
-            <w:tcW w:w="1134" w:type="dxa"/>
+            <w:tcW w:w="1701" w:type="dxa"/>
           </w:tcPr>
           <w:p>
             <w:pPr>
@@ -1299,7 +1328,7 @@
         </w:tc>
         <w:tc>
           <w:tcPr>
-            <w:tcW w:w="2052" w:type="dxa"/>
+            <w:tcW w:w="1768" w:type="dxa"/>
           </w:tcPr>
           <w:p>
             <w:pPr>
@@ -1326,14 +1355,13 @@
       <w:tr>
         <w:tc>
           <w:tcPr>
-            <w:tcW w:w="864" w:type="dxa"/>
+            <w:tcW w:w="675" w:type="dxa"/>
           </w:tcPr>
           <w:p>
             <w:pPr>
               <w:jc w:val="center"/>
               <w:rPr>
                 <w:rFonts w:ascii="Times New Roman" w:hAnsi="Times New Roman" w:cs="Times New Roman"/>
-                <w:b/>
                 <w:sz w:val="32"/>
                 <w:szCs w:val="40"/>
               </w:rPr>
@@ -1341,7 +1369,6 @@
             <w:r>
               <w:rPr>
                 <w:rFonts w:ascii="Times New Roman" w:hAnsi="Times New Roman" w:cs="Times New Roman"/>
-                <w:b/>
                 <w:sz w:val="32"/>
                 <w:szCs w:val="40"/>
               </w:rPr>
@@ -1351,7 +1378,7 @@
         </w:tc>
         <w:tc>
           <w:tcPr>
-            <w:tcW w:w="2160" w:type="dxa"/>
+            <w:tcW w:w="2127" w:type="dxa"/>
           </w:tcPr>
           <w:p>
             <w:pPr>
@@ -1375,7 +1402,7 @@
         </w:tc>
         <w:tc>
           <w:tcPr>
-            <w:tcW w:w="2329" w:type="dxa"/>
+            <w:tcW w:w="1984" w:type="dxa"/>
           </w:tcPr>
           <w:p>
             <w:pPr>
@@ -1397,7 +1424,7 @@
         </w:tc>
         <w:tc>
           <w:tcPr>
-            <w:tcW w:w="2693" w:type="dxa"/>
+            <w:tcW w:w="2977" w:type="dxa"/>
           </w:tcPr>
           <w:p>
             <w:pPr>
@@ -1421,7 +1448,7 @@
         </w:tc>
         <w:tc>
           <w:tcPr>
-            <w:tcW w:w="1134" w:type="dxa"/>
+            <w:tcW w:w="1701" w:type="dxa"/>
           </w:tcPr>
           <w:p>
             <w:pPr>
@@ -1444,7 +1471,7 @@
         </w:tc>
         <w:tc>
           <w:tcPr>
-            <w:tcW w:w="2052" w:type="dxa"/>
+            <w:tcW w:w="1768" w:type="dxa"/>
           </w:tcPr>
           <w:p>
             <w:pPr>
@@ -1471,7 +1498,7 @@
       <w:tr>
         <w:tc>
           <w:tcPr>
-            <w:tcW w:w="864" w:type="dxa"/>
+            <w:tcW w:w="675" w:type="dxa"/>
           </w:tcPr>
           <w:p>
             <w:pPr>
@@ -1494,7 +1521,7 @@
         </w:tc>
         <w:tc>
           <w:tcPr>
-            <w:tcW w:w="2160" w:type="dxa"/>
+            <w:tcW w:w="2127" w:type="dxa"/>
           </w:tcPr>
           <w:p>
             <w:pPr>
@@ -1517,7 +1544,7 @@
         </w:tc>
         <w:tc>
           <w:tcPr>
-            <w:tcW w:w="2329" w:type="dxa"/>
+            <w:tcW w:w="1984" w:type="dxa"/>
           </w:tcPr>
           <w:p>
             <w:pPr>
@@ -1539,12 +1566,13 @@
         </w:tc>
         <w:tc>
           <w:tcPr>
-            <w:tcW w:w="2693" w:type="dxa"/>
+            <w:tcW w:w="2977" w:type="dxa"/>
           </w:tcPr>
           <w:p>
             <w:pPr>
               <w:rPr>
                 <w:rFonts w:ascii="Times New Roman" w:hAnsi="Times New Roman" w:cs="Times New Roman"/>
+                <w:b/>
                 <w:sz w:val="32"/>
                 <w:szCs w:val="40"/>
               </w:rPr>
@@ -1562,7 +1590,7 @@
         </w:tc>
         <w:tc>
           <w:tcPr>
-            <w:tcW w:w="1134" w:type="dxa"/>
+            <w:tcW w:w="1701" w:type="dxa"/>
           </w:tcPr>
           <w:p>
             <w:pPr>
@@ -1585,7 +1613,7 @@
         </w:tc>
         <w:tc>
           <w:tcPr>
-            <w:tcW w:w="2052" w:type="dxa"/>
+            <w:tcW w:w="1768" w:type="dxa"/>
           </w:tcPr>
           <w:p>
             <w:pPr>
@@ -1612,7 +1640,7 @@
       <w:tr>
         <w:tc>
           <w:tcPr>
-            <w:tcW w:w="864" w:type="dxa"/>
+            <w:tcW w:w="675" w:type="dxa"/>
           </w:tcPr>
           <w:p>
             <w:pPr>
@@ -1635,7 +1663,7 @@
         </w:tc>
         <w:tc>
           <w:tcPr>
-            <w:tcW w:w="2160" w:type="dxa"/>
+            <w:tcW w:w="2127" w:type="dxa"/>
           </w:tcPr>
           <w:p>
             <w:pPr>
@@ -1659,7 +1687,7 @@
         </w:tc>
         <w:tc>
           <w:tcPr>
-            <w:tcW w:w="2329" w:type="dxa"/>
+            <w:tcW w:w="1984" w:type="dxa"/>
           </w:tcPr>
           <w:p>
             <w:pPr>
@@ -1681,12 +1709,13 @@
         </w:tc>
         <w:tc>
           <w:tcPr>
-            <w:tcW w:w="2693" w:type="dxa"/>
+            <w:tcW w:w="2977" w:type="dxa"/>
           </w:tcPr>
           <w:p>
             <w:pPr>
               <w:rPr>
                 <w:rFonts w:ascii="Times New Roman" w:hAnsi="Times New Roman" w:cs="Times New Roman"/>
+                <w:b/>
                 <w:sz w:val="32"/>
                 <w:szCs w:val="40"/>
               </w:rPr>
@@ -1694,16 +1723,26 @@
             <w:r>
               <w:rPr>
                 <w:rFonts w:ascii="Times New Roman" w:hAnsi="Times New Roman" w:cs="Times New Roman"/>
-                <w:sz w:val="32"/>
-                <w:szCs w:val="40"/>
-              </w:rPr>
-              <w:t>Nur Alam</w:t>
+                <w:b/>
+                <w:sz w:val="32"/>
+                <w:szCs w:val="40"/>
+              </w:rPr>
+              <w:t xml:space="preserve"> </w:t>
+            </w:r>
+            <w:r>
+              <w:rPr>
+                <w:rFonts w:ascii="Times New Roman" w:hAnsi="Times New Roman" w:cs="Times New Roman"/>
+                <w:b/>
+                <w:sz w:val="32"/>
+                <w:szCs w:val="40"/>
+              </w:rPr>
+              <w:t>Noor Bahar</w:t>
             </w:r>
           </w:p>
         </w:tc>
         <w:tc>
           <w:tcPr>
-            <w:tcW w:w="1134" w:type="dxa"/>
+            <w:tcW w:w="1701" w:type="dxa"/>
           </w:tcPr>
           <w:p>
             <w:pPr>
@@ -1720,13 +1759,21 @@
                 <w:sz w:val="28"/>
                 <w:szCs w:val="36"/>
               </w:rPr>
-              <w:t>Father</w:t>
+              <w:t xml:space="preserve"> </w:t>
+            </w:r>
+            <w:r>
+              <w:rPr>
+                <w:rFonts w:ascii="Times New Roman" w:hAnsi="Times New Roman" w:cs="Times New Roman"/>
+                <w:sz w:val="28"/>
+                <w:szCs w:val="36"/>
+              </w:rPr>
+              <w:t>Mother</w:t>
             </w:r>
           </w:p>
         </w:tc>
         <w:tc>
           <w:tcPr>
-            <w:tcW w:w="2052" w:type="dxa"/>
+            <w:tcW w:w="1768" w:type="dxa"/>
           </w:tcPr>
           <w:p>
             <w:pPr>
@@ -1753,7 +1800,7 @@
       <w:tr>
         <w:tc>
           <w:tcPr>
-            <w:tcW w:w="864" w:type="dxa"/>
+            <w:tcW w:w="675" w:type="dxa"/>
           </w:tcPr>
           <w:p>
             <w:pPr>
@@ -1776,7 +1823,7 @@
         </w:tc>
         <w:tc>
           <w:tcPr>
-            <w:tcW w:w="2160" w:type="dxa"/>
+            <w:tcW w:w="2127" w:type="dxa"/>
           </w:tcPr>
           <w:p>
             <w:pPr>
@@ -1797,7 +1844,6 @@
               </w:rPr>
               <w:t xml:space="preserve">Begum </w:t>
             </w:r>
-            <w:proofErr w:type="spellStart"/>
             <w:r>
               <w:rPr>
                 <w:rFonts w:ascii="Times New Roman" w:hAnsi="Times New Roman" w:cs="Times New Roman"/>
@@ -1805,14 +1851,22 @@
                 <w:sz w:val="32"/>
                 <w:szCs w:val="40"/>
               </w:rPr>
-              <w:t>rokeya</w:t>
+              <w:t>R</w:t>
             </w:r>
-            <w:proofErr w:type="spellEnd"/>
+            <w:r>
+              <w:rPr>
+                <w:rFonts w:ascii="Times New Roman" w:hAnsi="Times New Roman" w:cs="Times New Roman"/>
+                <w:b/>
+                <w:sz w:val="32"/>
+                <w:szCs w:val="40"/>
+              </w:rPr>
+              <w:t>okeya</w:t>
+            </w:r>
           </w:p>
         </w:tc>
         <w:tc>
           <w:tcPr>
-            <w:tcW w:w="2329" w:type="dxa"/>
+            <w:tcW w:w="1984" w:type="dxa"/>
           </w:tcPr>
           <w:p>
             <w:pPr>
@@ -1834,12 +1888,13 @@
         </w:tc>
         <w:tc>
           <w:tcPr>
-            <w:tcW w:w="2693" w:type="dxa"/>
+            <w:tcW w:w="2977" w:type="dxa"/>
           </w:tcPr>
           <w:p>
             <w:pPr>
               <w:rPr>
                 <w:rFonts w:ascii="Times New Roman" w:hAnsi="Times New Roman" w:cs="Times New Roman"/>
+                <w:b/>
                 <w:sz w:val="32"/>
                 <w:szCs w:val="40"/>
               </w:rPr>
@@ -1851,13 +1906,22 @@
                 <w:sz w:val="32"/>
                 <w:szCs w:val="40"/>
               </w:rPr>
-              <w:t>Mohammed Hashim</w:t>
+              <w:t xml:space="preserve"> </w:t>
+            </w:r>
+            <w:r>
+              <w:rPr>
+                <w:rFonts w:ascii="Times New Roman" w:hAnsi="Times New Roman" w:cs="Times New Roman"/>
+                <w:b/>
+                <w:sz w:val="32"/>
+                <w:szCs w:val="40"/>
+              </w:rPr>
+              <w:t>Setara Begum</w:t>
             </w:r>
           </w:p>
         </w:tc>
         <w:tc>
           <w:tcPr>
-            <w:tcW w:w="1134" w:type="dxa"/>
+            <w:tcW w:w="1701" w:type="dxa"/>
           </w:tcPr>
           <w:p>
             <w:pPr>
@@ -1874,13 +1938,13 @@
                 <w:sz w:val="28"/>
                 <w:szCs w:val="36"/>
               </w:rPr>
-              <w:t>Father</w:t>
+              <w:t>Mother</w:t>
             </w:r>
           </w:p>
         </w:tc>
         <w:tc>
           <w:tcPr>
-            <w:tcW w:w="2052" w:type="dxa"/>
+            <w:tcW w:w="1768" w:type="dxa"/>
           </w:tcPr>
           <w:p>
             <w:pPr>
@@ -1897,7 +1961,7 @@
       <w:tr>
         <w:tc>
           <w:tcPr>
-            <w:tcW w:w="864" w:type="dxa"/>
+            <w:tcW w:w="675" w:type="dxa"/>
           </w:tcPr>
           <w:p>
             <w:pPr>
@@ -1920,7 +1984,7 @@
         </w:tc>
         <w:tc>
           <w:tcPr>
-            <w:tcW w:w="2160" w:type="dxa"/>
+            <w:tcW w:w="2127" w:type="dxa"/>
           </w:tcPr>
           <w:p>
             <w:pPr>
@@ -1943,7 +2007,7 @@
         </w:tc>
         <w:tc>
           <w:tcPr>
-            <w:tcW w:w="2329" w:type="dxa"/>
+            <w:tcW w:w="1984" w:type="dxa"/>
           </w:tcPr>
           <w:p>
             <w:pPr>
@@ -1965,12 +2029,13 @@
         </w:tc>
         <w:tc>
           <w:tcPr>
-            <w:tcW w:w="2693" w:type="dxa"/>
+            <w:tcW w:w="2977" w:type="dxa"/>
           </w:tcPr>
           <w:p>
             <w:pPr>
               <w:rPr>
                 <w:rFonts w:ascii="Times New Roman" w:hAnsi="Times New Roman" w:cs="Times New Roman"/>
+                <w:b/>
                 <w:sz w:val="32"/>
                 <w:szCs w:val="40"/>
               </w:rPr>
@@ -1988,7 +2053,7 @@
         </w:tc>
         <w:tc>
           <w:tcPr>
-            <w:tcW w:w="1134" w:type="dxa"/>
+            <w:tcW w:w="1701" w:type="dxa"/>
           </w:tcPr>
           <w:p>
             <w:pPr>
@@ -2011,7 +2076,7 @@
         </w:tc>
         <w:tc>
           <w:tcPr>
-            <w:tcW w:w="2052" w:type="dxa"/>
+            <w:tcW w:w="1768" w:type="dxa"/>
           </w:tcPr>
           <w:p>
             <w:pPr>
@@ -2038,7 +2103,7 @@
       <w:tr>
         <w:tc>
           <w:tcPr>
-            <w:tcW w:w="864" w:type="dxa"/>
+            <w:tcW w:w="675" w:type="dxa"/>
           </w:tcPr>
           <w:p>
             <w:pPr>
@@ -2061,7 +2126,7 @@
         </w:tc>
         <w:tc>
           <w:tcPr>
-            <w:tcW w:w="2160" w:type="dxa"/>
+            <w:tcW w:w="2127" w:type="dxa"/>
           </w:tcPr>
           <w:p>
             <w:pPr>
@@ -2084,7 +2149,7 @@
         </w:tc>
         <w:tc>
           <w:tcPr>
-            <w:tcW w:w="2329" w:type="dxa"/>
+            <w:tcW w:w="1984" w:type="dxa"/>
           </w:tcPr>
           <w:p>
             <w:pPr>
@@ -2106,12 +2171,13 @@
         </w:tc>
         <w:tc>
           <w:tcPr>
-            <w:tcW w:w="2693" w:type="dxa"/>
+            <w:tcW w:w="2977" w:type="dxa"/>
           </w:tcPr>
           <w:p>
             <w:pPr>
               <w:rPr>
                 <w:rFonts w:ascii="Times New Roman" w:hAnsi="Times New Roman" w:cs="Times New Roman"/>
+                <w:b/>
                 <w:sz w:val="32"/>
                 <w:szCs w:val="40"/>
               </w:rPr>
@@ -2129,7 +2195,7 @@
         </w:tc>
         <w:tc>
           <w:tcPr>
-            <w:tcW w:w="1134" w:type="dxa"/>
+            <w:tcW w:w="1701" w:type="dxa"/>
           </w:tcPr>
           <w:p>
             <w:pPr>
@@ -2152,8 +2218,18 @@
         </w:tc>
         <w:tc>
           <w:tcPr>
-            <w:tcW w:w="2052" w:type="dxa"/>
+            <w:tcW w:w="1768" w:type="dxa"/>
           </w:tcPr>
+          <w:p>
+            <w:pPr>
+              <w:jc w:val="center"/>
+              <w:rPr>
+                <w:rFonts w:ascii="Times New Roman" w:hAnsi="Times New Roman" w:cs="Times New Roman"/>
+                <w:sz w:val="32"/>
+                <w:szCs w:val="40"/>
+              </w:rPr>
+            </w:pPr>
+          </w:p>
           <w:p>
             <w:pPr>
               <w:jc w:val="center"/>
@@ -2169,7 +2245,7 @@
       <w:tr>
         <w:tc>
           <w:tcPr>
-            <w:tcW w:w="864" w:type="dxa"/>
+            <w:tcW w:w="675" w:type="dxa"/>
           </w:tcPr>
           <w:p>
             <w:pPr>
@@ -2192,7 +2268,7 @@
         </w:tc>
         <w:tc>
           <w:tcPr>
-            <w:tcW w:w="2160" w:type="dxa"/>
+            <w:tcW w:w="2127" w:type="dxa"/>
           </w:tcPr>
           <w:p>
             <w:pPr>
@@ -2215,7 +2291,7 @@
         </w:tc>
         <w:tc>
           <w:tcPr>
-            <w:tcW w:w="2329" w:type="dxa"/>
+            <w:tcW w:w="1984" w:type="dxa"/>
           </w:tcPr>
           <w:p>
             <w:pPr>
@@ -2237,16 +2313,18 @@
         </w:tc>
         <w:tc>
           <w:tcPr>
-            <w:tcW w:w="2693" w:type="dxa"/>
+            <w:tcW w:w="2977" w:type="dxa"/>
           </w:tcPr>
           <w:p>
             <w:pPr>
               <w:rPr>
                 <w:rFonts w:ascii="Times New Roman" w:hAnsi="Times New Roman" w:cs="Times New Roman"/>
+                <w:b/>
                 <w:sz w:val="32"/>
                 <w:szCs w:val="40"/>
               </w:rPr>
             </w:pPr>
+            <w:proofErr w:type="spellStart"/>
             <w:r>
               <w:rPr>
                 <w:rFonts w:ascii="Times New Roman" w:hAnsi="Times New Roman" w:cs="Times New Roman"/>
@@ -2254,13 +2332,23 @@
                 <w:sz w:val="32"/>
                 <w:szCs w:val="40"/>
               </w:rPr>
-              <w:t>Mohammed Siddik</w:t>
+              <w:t>Sonjida</w:t>
+            </w:r>
+            <w:proofErr w:type="spellEnd"/>
+            <w:r>
+              <w:rPr>
+                <w:rFonts w:ascii="Times New Roman" w:hAnsi="Times New Roman" w:cs="Times New Roman"/>
+                <w:b/>
+                <w:sz w:val="32"/>
+                <w:szCs w:val="40"/>
+              </w:rPr>
+              <w:t xml:space="preserve"> Begum</w:t>
             </w:r>
           </w:p>
         </w:tc>
         <w:tc>
           <w:tcPr>
-            <w:tcW w:w="1134" w:type="dxa"/>
+            <w:tcW w:w="1701" w:type="dxa"/>
           </w:tcPr>
           <w:p>
             <w:pPr>
@@ -2277,13 +2365,13 @@
                 <w:sz w:val="28"/>
                 <w:szCs w:val="36"/>
               </w:rPr>
-              <w:t>Father</w:t>
+              <w:t>Mother</w:t>
             </w:r>
           </w:p>
         </w:tc>
         <w:tc>
           <w:tcPr>
-            <w:tcW w:w="2052" w:type="dxa"/>
+            <w:tcW w:w="1768" w:type="dxa"/>
           </w:tcPr>
           <w:p>
             <w:pPr>
@@ -2300,7 +2388,7 @@
       <w:tr>
         <w:tc>
           <w:tcPr>
-            <w:tcW w:w="864" w:type="dxa"/>
+            <w:tcW w:w="675" w:type="dxa"/>
           </w:tcPr>
           <w:p>
             <w:pPr>
@@ -2323,7 +2411,7 @@
         </w:tc>
         <w:tc>
           <w:tcPr>
-            <w:tcW w:w="2160" w:type="dxa"/>
+            <w:tcW w:w="2127" w:type="dxa"/>
           </w:tcPr>
           <w:p>
             <w:pPr>
@@ -2346,7 +2434,7 @@
         </w:tc>
         <w:tc>
           <w:tcPr>
-            <w:tcW w:w="2329" w:type="dxa"/>
+            <w:tcW w:w="1984" w:type="dxa"/>
           </w:tcPr>
           <w:p>
             <w:pPr>
@@ -2368,12 +2456,13 @@
         </w:tc>
         <w:tc>
           <w:tcPr>
-            <w:tcW w:w="2693" w:type="dxa"/>
+            <w:tcW w:w="2977" w:type="dxa"/>
           </w:tcPr>
           <w:p>
             <w:pPr>
               <w:rPr>
                 <w:rFonts w:ascii="Times New Roman" w:hAnsi="Times New Roman" w:cs="Times New Roman"/>
+                <w:b/>
                 <w:sz w:val="32"/>
                 <w:szCs w:val="40"/>
               </w:rPr>
@@ -2391,7 +2480,7 @@
         </w:tc>
         <w:tc>
           <w:tcPr>
-            <w:tcW w:w="1134" w:type="dxa"/>
+            <w:tcW w:w="1701" w:type="dxa"/>
           </w:tcPr>
           <w:p>
             <w:pPr>
@@ -2414,7 +2503,7 @@
         </w:tc>
         <w:tc>
           <w:tcPr>
-            <w:tcW w:w="2052" w:type="dxa"/>
+            <w:tcW w:w="1768" w:type="dxa"/>
           </w:tcPr>
           <w:p>
             <w:pPr>
@@ -2441,7 +2530,7 @@
       <w:tr>
         <w:tc>
           <w:tcPr>
-            <w:tcW w:w="864" w:type="dxa"/>
+            <w:tcW w:w="675" w:type="dxa"/>
           </w:tcPr>
           <w:p>
             <w:pPr>
@@ -2464,7 +2553,7 @@
         </w:tc>
         <w:tc>
           <w:tcPr>
-            <w:tcW w:w="2160" w:type="dxa"/>
+            <w:tcW w:w="2127" w:type="dxa"/>
           </w:tcPr>
           <w:p>
             <w:pPr>
@@ -2498,7 +2587,7 @@
         </w:tc>
         <w:tc>
           <w:tcPr>
-            <w:tcW w:w="2329" w:type="dxa"/>
+            <w:tcW w:w="1984" w:type="dxa"/>
           </w:tcPr>
           <w:p>
             <w:pPr>
@@ -2520,12 +2609,13 @@
         </w:tc>
         <w:tc>
           <w:tcPr>
-            <w:tcW w:w="2693" w:type="dxa"/>
+            <w:tcW w:w="2977" w:type="dxa"/>
           </w:tcPr>
           <w:p>
             <w:pPr>
               <w:rPr>
                 <w:rFonts w:ascii="Times New Roman" w:hAnsi="Times New Roman" w:cs="Times New Roman"/>
+                <w:b/>
                 <w:sz w:val="32"/>
                 <w:szCs w:val="40"/>
               </w:rPr>
@@ -2543,7 +2633,7 @@
         </w:tc>
         <w:tc>
           <w:tcPr>
-            <w:tcW w:w="1134" w:type="dxa"/>
+            <w:tcW w:w="1701" w:type="dxa"/>
           </w:tcPr>
           <w:p>
             <w:pPr>
@@ -2566,7 +2656,7 @@
         </w:tc>
         <w:tc>
           <w:tcPr>
-            <w:tcW w:w="2052" w:type="dxa"/>
+            <w:tcW w:w="1768" w:type="dxa"/>
           </w:tcPr>
           <w:p>
             <w:pPr>
@@ -2593,14 +2683,13 @@
       <w:tr>
         <w:tc>
           <w:tcPr>
-            <w:tcW w:w="864" w:type="dxa"/>
+            <w:tcW w:w="675" w:type="dxa"/>
           </w:tcPr>
           <w:p>
             <w:pPr>
               <w:jc w:val="center"/>
               <w:rPr>
                 <w:rFonts w:ascii="Times New Roman" w:hAnsi="Times New Roman" w:cs="Times New Roman"/>
-                <w:b/>
                 <w:sz w:val="32"/>
                 <w:szCs w:val="40"/>
               </w:rPr>
@@ -2608,7 +2697,6 @@
             <w:r>
               <w:rPr>
                 <w:rFonts w:ascii="Times New Roman" w:hAnsi="Times New Roman" w:cs="Times New Roman"/>
-                <w:b/>
                 <w:sz w:val="32"/>
                 <w:szCs w:val="40"/>
               </w:rPr>
@@ -2618,7 +2706,7 @@
         </w:tc>
         <w:tc>
           <w:tcPr>
-            <w:tcW w:w="2160" w:type="dxa"/>
+            <w:tcW w:w="2127" w:type="dxa"/>
           </w:tcPr>
           <w:p>
             <w:pPr>
@@ -2643,7 +2731,7 @@
         </w:tc>
         <w:tc>
           <w:tcPr>
-            <w:tcW w:w="2329" w:type="dxa"/>
+            <w:tcW w:w="1984" w:type="dxa"/>
           </w:tcPr>
           <w:p>
             <w:pPr>
@@ -2665,12 +2753,13 @@
         </w:tc>
         <w:tc>
           <w:tcPr>
-            <w:tcW w:w="2693" w:type="dxa"/>
+            <w:tcW w:w="2977" w:type="dxa"/>
           </w:tcPr>
           <w:p>
             <w:pPr>
               <w:rPr>
                 <w:rFonts w:ascii="Times New Roman" w:hAnsi="Times New Roman" w:cs="Times New Roman"/>
+                <w:b/>
                 <w:sz w:val="32"/>
                 <w:szCs w:val="40"/>
               </w:rPr>
@@ -2699,7 +2788,7 @@
         </w:tc>
         <w:tc>
           <w:tcPr>
-            <w:tcW w:w="1134" w:type="dxa"/>
+            <w:tcW w:w="1701" w:type="dxa"/>
           </w:tcPr>
           <w:p>
             <w:pPr>
@@ -2722,7 +2811,7 @@
         </w:tc>
         <w:tc>
           <w:tcPr>
-            <w:tcW w:w="2052" w:type="dxa"/>
+            <w:tcW w:w="1768" w:type="dxa"/>
           </w:tcPr>
           <w:p>
             <w:pPr>
@@ -2749,7 +2838,7 @@
       <w:tr>
         <w:tc>
           <w:tcPr>
-            <w:tcW w:w="864" w:type="dxa"/>
+            <w:tcW w:w="675" w:type="dxa"/>
           </w:tcPr>
           <w:p>
             <w:pPr>
@@ -2763,7 +2852,6 @@
             <w:r>
               <w:rPr>
                 <w:rFonts w:ascii="Times New Roman" w:hAnsi="Times New Roman" w:cs="Times New Roman"/>
-                <w:b/>
                 <w:sz w:val="32"/>
                 <w:szCs w:val="40"/>
               </w:rPr>
@@ -2772,7 +2860,6 @@
             <w:r>
               <w:rPr>
                 <w:rFonts w:ascii="Times New Roman" w:hAnsi="Times New Roman" w:cs="Times New Roman"/>
-                <w:b/>
                 <w:sz w:val="32"/>
                 <w:szCs w:val="40"/>
               </w:rPr>
@@ -2782,7 +2869,7 @@
         </w:tc>
         <w:tc>
           <w:tcPr>
-            <w:tcW w:w="2160" w:type="dxa"/>
+            <w:tcW w:w="2127" w:type="dxa"/>
           </w:tcPr>
           <w:p>
             <w:pPr>
@@ -2805,7 +2892,7 @@
         </w:tc>
         <w:tc>
           <w:tcPr>
-            <w:tcW w:w="2329" w:type="dxa"/>
+            <w:tcW w:w="1984" w:type="dxa"/>
           </w:tcPr>
           <w:p>
             <w:pPr>
@@ -2827,17 +2914,17 @@
         </w:tc>
         <w:tc>
           <w:tcPr>
-            <w:tcW w:w="2693" w:type="dxa"/>
+            <w:tcW w:w="2977" w:type="dxa"/>
           </w:tcPr>
           <w:p>
             <w:pPr>
               <w:rPr>
                 <w:rFonts w:ascii="Times New Roman" w:hAnsi="Times New Roman" w:cs="Times New Roman"/>
+                <w:b/>
                 <w:sz w:val="32"/>
                 <w:szCs w:val="40"/>
               </w:rPr>
             </w:pPr>
-            <w:proofErr w:type="spellStart"/>
             <w:r>
               <w:rPr>
                 <w:rFonts w:ascii="Times New Roman" w:hAnsi="Times New Roman" w:cs="Times New Roman"/>
@@ -2845,23 +2932,13 @@
                 <w:sz w:val="32"/>
                 <w:szCs w:val="40"/>
               </w:rPr>
-              <w:t>Ziyabu</w:t>
-            </w:r>
-            <w:proofErr w:type="spellEnd"/>
-            <w:r>
-              <w:rPr>
-                <w:rFonts w:ascii="Times New Roman" w:hAnsi="Times New Roman" w:cs="Times New Roman"/>
-                <w:b/>
-                <w:sz w:val="32"/>
-                <w:szCs w:val="40"/>
-              </w:rPr>
-              <w:t xml:space="preserve"> Rahman</w:t>
+              <w:t>Rokeya</w:t>
             </w:r>
           </w:p>
         </w:tc>
         <w:tc>
           <w:tcPr>
-            <w:tcW w:w="1134" w:type="dxa"/>
+            <w:tcW w:w="1701" w:type="dxa"/>
           </w:tcPr>
           <w:p>
             <w:pPr>
@@ -2878,13 +2955,13 @@
                 <w:sz w:val="28"/>
                 <w:szCs w:val="36"/>
               </w:rPr>
-              <w:t>Father</w:t>
+              <w:t>Mother</w:t>
             </w:r>
           </w:p>
         </w:tc>
         <w:tc>
           <w:tcPr>
-            <w:tcW w:w="2052" w:type="dxa"/>
+            <w:tcW w:w="1768" w:type="dxa"/>
           </w:tcPr>
           <w:p>
             <w:pPr>
@@ -2911,7 +2988,7 @@
       <w:tr>
         <w:tc>
           <w:tcPr>
-            <w:tcW w:w="864" w:type="dxa"/>
+            <w:tcW w:w="675" w:type="dxa"/>
           </w:tcPr>
           <w:p>
             <w:pPr>
@@ -2928,14 +3005,13 @@
                 <w:sz w:val="32"/>
                 <w:szCs w:val="40"/>
               </w:rPr>
-              <w:lastRenderedPageBreak/>
               <w:t>17.</w:t>
             </w:r>
           </w:p>
         </w:tc>
         <w:tc>
           <w:tcPr>
-            <w:tcW w:w="2160" w:type="dxa"/>
+            <w:tcW w:w="2127" w:type="dxa"/>
           </w:tcPr>
           <w:p>
             <w:pPr>
@@ -2958,7 +3034,7 @@
         </w:tc>
         <w:tc>
           <w:tcPr>
-            <w:tcW w:w="2329" w:type="dxa"/>
+            <w:tcW w:w="1984" w:type="dxa"/>
           </w:tcPr>
           <w:p>
             <w:pPr>
@@ -2980,12 +3056,13 @@
         </w:tc>
         <w:tc>
           <w:tcPr>
-            <w:tcW w:w="2693" w:type="dxa"/>
+            <w:tcW w:w="2977" w:type="dxa"/>
           </w:tcPr>
           <w:p>
             <w:pPr>
               <w:rPr>
                 <w:rFonts w:ascii="Times New Roman" w:hAnsi="Times New Roman" w:cs="Times New Roman"/>
+                <w:b/>
                 <w:sz w:val="32"/>
                 <w:szCs w:val="40"/>
               </w:rPr>
@@ -2997,13 +3074,13 @@
                 <w:sz w:val="32"/>
                 <w:szCs w:val="40"/>
               </w:rPr>
-              <w:t>Ashraf Alam</w:t>
+              <w:t>Azida</w:t>
             </w:r>
           </w:p>
         </w:tc>
         <w:tc>
           <w:tcPr>
-            <w:tcW w:w="1134" w:type="dxa"/>
+            <w:tcW w:w="1701" w:type="dxa"/>
           </w:tcPr>
           <w:p>
             <w:pPr>
@@ -3020,13 +3097,13 @@
                 <w:sz w:val="28"/>
                 <w:szCs w:val="36"/>
               </w:rPr>
-              <w:t>Father</w:t>
+              <w:t>Mother</w:t>
             </w:r>
           </w:p>
         </w:tc>
         <w:tc>
           <w:tcPr>
-            <w:tcW w:w="2052" w:type="dxa"/>
+            <w:tcW w:w="1768" w:type="dxa"/>
           </w:tcPr>
           <w:p>
             <w:pPr>
@@ -3053,7 +3130,7 @@
       <w:tr>
         <w:tc>
           <w:tcPr>
-            <w:tcW w:w="864" w:type="dxa"/>
+            <w:tcW w:w="675" w:type="dxa"/>
           </w:tcPr>
           <w:p>
             <w:pPr>
@@ -3076,7 +3153,7 @@
         </w:tc>
         <w:tc>
           <w:tcPr>
-            <w:tcW w:w="2160" w:type="dxa"/>
+            <w:tcW w:w="2127" w:type="dxa"/>
           </w:tcPr>
           <w:p>
             <w:pPr>
@@ -3099,7 +3176,7 @@
         </w:tc>
         <w:tc>
           <w:tcPr>
-            <w:tcW w:w="2329" w:type="dxa"/>
+            <w:tcW w:w="1984" w:type="dxa"/>
           </w:tcPr>
           <w:p>
             <w:pPr>
@@ -3121,12 +3198,13 @@
         </w:tc>
         <w:tc>
           <w:tcPr>
-            <w:tcW w:w="2693" w:type="dxa"/>
+            <w:tcW w:w="2977" w:type="dxa"/>
           </w:tcPr>
           <w:p>
             <w:pPr>
               <w:rPr>
                 <w:rFonts w:ascii="Times New Roman" w:hAnsi="Times New Roman" w:cs="Times New Roman"/>
+                <w:b/>
                 <w:sz w:val="32"/>
                 <w:szCs w:val="40"/>
               </w:rPr>
@@ -3144,7 +3222,7 @@
         </w:tc>
         <w:tc>
           <w:tcPr>
-            <w:tcW w:w="1134" w:type="dxa"/>
+            <w:tcW w:w="1701" w:type="dxa"/>
           </w:tcPr>
           <w:p>
             <w:pPr>
@@ -3167,7 +3245,7 @@
         </w:tc>
         <w:tc>
           <w:tcPr>
-            <w:tcW w:w="2052" w:type="dxa"/>
+            <w:tcW w:w="1768" w:type="dxa"/>
           </w:tcPr>
           <w:p>
             <w:pPr>
@@ -3194,7 +3272,7 @@
       <w:tr>
         <w:tc>
           <w:tcPr>
-            <w:tcW w:w="864" w:type="dxa"/>
+            <w:tcW w:w="675" w:type="dxa"/>
           </w:tcPr>
           <w:p>
             <w:pPr>
@@ -3217,7 +3295,7 @@
         </w:tc>
         <w:tc>
           <w:tcPr>
-            <w:tcW w:w="2160" w:type="dxa"/>
+            <w:tcW w:w="2127" w:type="dxa"/>
           </w:tcPr>
           <w:p>
             <w:pPr>
@@ -3240,7 +3318,7 @@
         </w:tc>
         <w:tc>
           <w:tcPr>
-            <w:tcW w:w="2329" w:type="dxa"/>
+            <w:tcW w:w="1984" w:type="dxa"/>
           </w:tcPr>
           <w:p>
             <w:pPr>
@@ -3262,12 +3340,13 @@
         </w:tc>
         <w:tc>
           <w:tcPr>
-            <w:tcW w:w="2693" w:type="dxa"/>
+            <w:tcW w:w="2977" w:type="dxa"/>
           </w:tcPr>
           <w:p>
             <w:pPr>
               <w:rPr>
                 <w:rFonts w:ascii="Times New Roman" w:hAnsi="Times New Roman" w:cs="Times New Roman"/>
+                <w:b/>
                 <w:sz w:val="32"/>
                 <w:szCs w:val="40"/>
               </w:rPr>
@@ -3285,7 +3364,7 @@
         </w:tc>
         <w:tc>
           <w:tcPr>
-            <w:tcW w:w="1134" w:type="dxa"/>
+            <w:tcW w:w="1701" w:type="dxa"/>
           </w:tcPr>
           <w:p>
             <w:pPr>
@@ -3308,7 +3387,7 @@
         </w:tc>
         <w:tc>
           <w:tcPr>
-            <w:tcW w:w="2052" w:type="dxa"/>
+            <w:tcW w:w="1768" w:type="dxa"/>
           </w:tcPr>
           <w:p>
             <w:pPr>
@@ -3335,7 +3414,7 @@
       <w:tr>
         <w:tc>
           <w:tcPr>
-            <w:tcW w:w="864" w:type="dxa"/>
+            <w:tcW w:w="675" w:type="dxa"/>
           </w:tcPr>
           <w:p>
             <w:pPr>
@@ -3358,7 +3437,7 @@
         </w:tc>
         <w:tc>
           <w:tcPr>
-            <w:tcW w:w="2160" w:type="dxa"/>
+            <w:tcW w:w="2127" w:type="dxa"/>
           </w:tcPr>
           <w:p>
             <w:pPr>
@@ -3381,7 +3460,7 @@
         </w:tc>
         <w:tc>
           <w:tcPr>
-            <w:tcW w:w="2329" w:type="dxa"/>
+            <w:tcW w:w="1984" w:type="dxa"/>
           </w:tcPr>
           <w:p>
             <w:pPr>
@@ -3403,12 +3482,13 @@
         </w:tc>
         <w:tc>
           <w:tcPr>
-            <w:tcW w:w="2693" w:type="dxa"/>
+            <w:tcW w:w="2977" w:type="dxa"/>
           </w:tcPr>
           <w:p>
             <w:pPr>
               <w:rPr>
                 <w:rFonts w:ascii="Times New Roman" w:hAnsi="Times New Roman" w:cs="Times New Roman"/>
+                <w:b/>
                 <w:sz w:val="32"/>
                 <w:szCs w:val="40"/>
               </w:rPr>
@@ -3420,13 +3500,22 @@
                 <w:sz w:val="32"/>
                 <w:szCs w:val="40"/>
               </w:rPr>
-              <w:t>Zahir Ahmed</w:t>
+              <w:t>Mori</w:t>
+            </w:r>
+            <w:r>
+              <w:rPr>
+                <w:rFonts w:ascii="Times New Roman" w:hAnsi="Times New Roman" w:cs="Times New Roman"/>
+                <w:b/>
+                <w:sz w:val="32"/>
+                <w:szCs w:val="40"/>
+              </w:rPr>
+              <w:t>um Khatun</w:t>
             </w:r>
           </w:p>
         </w:tc>
         <w:tc>
           <w:tcPr>
-            <w:tcW w:w="1134" w:type="dxa"/>
+            <w:tcW w:w="1701" w:type="dxa"/>
           </w:tcPr>
           <w:p>
             <w:pPr>
@@ -3443,13 +3532,13 @@
                 <w:sz w:val="28"/>
                 <w:szCs w:val="36"/>
               </w:rPr>
-              <w:t>Father</w:t>
+              <w:t>Mother</w:t>
             </w:r>
           </w:p>
         </w:tc>
         <w:tc>
           <w:tcPr>
-            <w:tcW w:w="2052" w:type="dxa"/>
+            <w:tcW w:w="1768" w:type="dxa"/>
           </w:tcPr>
           <w:p>
             <w:pPr>
@@ -3485,8 +3574,8 @@
       </w:pPr>
     </w:p>
     <w:sectPr>
-      <w:pgSz w:w="12240" w:h="15840"/>
-      <w:pgMar w:top="936" w:right="936" w:bottom="936" w:left="936" w:header="720" w:footer="720" w:gutter="0"/>
+      <w:pgSz w:w="11906" w:h="16838" w:code="9"/>
+      <w:pgMar w:top="720" w:right="720" w:bottom="720" w:left="720" w:header="720" w:footer="720" w:gutter="0"/>
       <w:cols w:space="720"/>
       <w:docGrid w:linePitch="360"/>
     </w:sectPr>

</xml_diff>